<commit_message>
fix: correct install cmd (git clone + install.sh); update test matrix 344->466 with all 12 files
</commit_message>
<xml_diff>
--- a/docs/GeoClaw-claude_Beginner_Guide_v3.1.0.docx
+++ b/docs/GeoClaw-claude_Beginner_Guide_v3.1.0.docx
@@ -722,7 +722,23 @@
           <w:sz w:val="19"/>
           <w:szCs w:val="19"/>
         </w:rPr>
-        <w:t xml:space="preserve">pip install geoclaw-claude</w:t>
+        <w:t xml:space="preserve">git clone https://github.com/whuyao/GeoClaw_Claude.git</w:t>
+      </w:r>
+    </w:p>
+    <w:p>
+      <w:pPr>
+        <w:shd w:fill="F0F7FF" w:val="clear"/>
+        <w:spacing w:before="0" w:after="16"/>
+        <w:ind w:left="260" w:right="200"/>
+      </w:pPr>
+      <w:r>
+        <w:rPr>
+          <w:rFonts w:ascii="Courier New" w:cs="Courier New" w:eastAsia="Courier New" w:hAnsi="Courier New"/>
+          <w:color w:val="1A3A5C"/>
+          <w:sz w:val="19"/>
+          <w:szCs w:val="19"/>
+        </w:rPr>
+        <w:t xml:space="preserve">cd GeoClaw_Claude &amp;&amp; bash install.sh</w:t>
       </w:r>
     </w:p>
     <w:p>

</xml_diff>